<commit_message>
226 : Remplacer la notion de Prêteur dans les template par Organisme financeur
</commit_message>
<xml_diff>
--- a/documents/Avenant2ndeVie-HLM-template.docx
+++ b/documents/Avenant2ndeVie-HLM-template.docx
@@ -21,7 +21,7 @@
           <w:szCs w:val="22"/>
           <w:lang w:eastAsia="fr-FR"/>
         </w:rPr>
-        <w:t xml:space="preserve">{% </w:t>
+        <w:t>{% if</w:t>
       </w:r>
       <w:r>
         <w:rPr>
@@ -29,7 +29,7 @@
           <w:szCs w:val="22"/>
           <w:lang w:eastAsia="fr-FR"/>
         </w:rPr>
-        <w:t>if</w:t>
+        <w:t xml:space="preserve"> convention.</w:t>
       </w:r>
       <w:r>
         <w:rPr>
@@ -37,7 +37,7 @@
           <w:szCs w:val="22"/>
           <w:lang w:eastAsia="fr-FR"/>
         </w:rPr>
-        <w:t xml:space="preserve"> convention.</w:t>
+        <w:t>parents_2nd_vie</w:t>
       </w:r>
       <w:r>
         <w:rPr>
@@ -45,7 +45,7 @@
           <w:szCs w:val="22"/>
           <w:lang w:eastAsia="fr-FR"/>
         </w:rPr>
-        <w:t>parents_2nd_vie</w:t>
+        <w:t>.all()</w:t>
       </w:r>
       <w:r>
         <w:rPr>
@@ -53,33 +53,79 @@
           <w:szCs w:val="22"/>
           <w:lang w:eastAsia="fr-FR"/>
         </w:rPr>
-        <w:t>.all()</w:t>
-      </w:r>
+        <w:t>|</w:t>
+      </w:r>
+      <w:proofErr w:type="spellStart"/>
       <w:r>
         <w:rPr>
           <w:color w:val="000000"/>
           <w:szCs w:val="22"/>
           <w:lang w:eastAsia="fr-FR"/>
         </w:rPr>
-        <w:t>|</w:t>
-      </w:r>
-      <w:proofErr w:type="spellStart"/>
+        <w:t>length</w:t>
+      </w:r>
+      <w:proofErr w:type="spellEnd"/>
       <w:r>
         <w:rPr>
           <w:color w:val="000000"/>
           <w:szCs w:val="22"/>
           <w:lang w:eastAsia="fr-FR"/>
         </w:rPr>
-        <w:t>length</w:t>
+        <w:t xml:space="preserve"> == 1 %}Avenant à la convention</w:t>
+      </w:r>
+      <w:r>
+        <w:rPr>
+          <w:rFonts w:cs="TimesNewRomanPSMT"/>
+          <w:bCs/>
+        </w:rPr>
+        <w:t xml:space="preserve">{% </w:t>
+      </w:r>
+      <w:proofErr w:type="spellStart"/>
+      <w:r>
+        <w:rPr>
+          <w:rFonts w:cs="TimesNewRomanPSMT"/>
+          <w:bCs/>
+        </w:rPr>
+        <w:t>else</w:t>
       </w:r>
       <w:proofErr w:type="spellEnd"/>
+      <w:r>
+        <w:rPr>
+          <w:rFonts w:cs="TimesNewRomanPSMT"/>
+          <w:bCs/>
+        </w:rPr>
+        <w:t xml:space="preserve"> %}</w:t>
+      </w:r>
       <w:r>
         <w:rPr>
           <w:color w:val="000000"/>
           <w:szCs w:val="22"/>
           <w:lang w:eastAsia="fr-FR"/>
         </w:rPr>
-        <w:t xml:space="preserve"> == 1</w:t>
+        <w:t>Avenant aux conventions</w:t>
+      </w:r>
+      <w:r>
+        <w:rPr>
+          <w:rFonts w:cs="TimesNewRomanPSMT"/>
+          <w:bCs/>
+        </w:rPr>
+        <w:t xml:space="preserve">{% </w:t>
+      </w:r>
+      <w:proofErr w:type="spellStart"/>
+      <w:r>
+        <w:rPr>
+          <w:rFonts w:cs="TimesNewRomanPSMT"/>
+          <w:bCs/>
+        </w:rPr>
+        <w:t>endif</w:t>
+      </w:r>
+      <w:proofErr w:type="spellEnd"/>
+      <w:r>
+        <w:rPr>
+          <w:rFonts w:cs="TimesNewRomanPSMT"/>
+          <w:bCs/>
+        </w:rPr>
+        <w:t xml:space="preserve"> %}</w:t>
       </w:r>
       <w:r>
         <w:rPr>
@@ -87,7 +133,7 @@
           <w:szCs w:val="22"/>
           <w:lang w:eastAsia="fr-FR"/>
         </w:rPr>
-        <w:t xml:space="preserve"> %}</w:t>
+        <w:t xml:space="preserve"> n°</w:t>
       </w:r>
       <w:r>
         <w:rPr>
@@ -95,30 +141,7 @@
           <w:szCs w:val="22"/>
           <w:lang w:eastAsia="fr-FR"/>
         </w:rPr>
-        <w:t>Avenant à la convention</w:t>
-      </w:r>
-      <w:r>
-        <w:rPr>
-          <w:rFonts w:cs="TimesNewRomanPSMT"/>
-          <w:bCs/>
-        </w:rPr>
         <w:t xml:space="preserve">{% </w:t>
-      </w:r>
-      <w:proofErr w:type="spellStart"/>
-      <w:r>
-        <w:rPr>
-          <w:rFonts w:cs="TimesNewRomanPSMT"/>
-          <w:bCs/>
-        </w:rPr>
-        <w:t>else</w:t>
-      </w:r>
-      <w:proofErr w:type="spellEnd"/>
-      <w:r>
-        <w:rPr>
-          <w:rFonts w:cs="TimesNewRomanPSMT"/>
-          <w:bCs/>
-        </w:rPr>
-        <w:t xml:space="preserve"> %}</w:t>
       </w:r>
       <w:r>
         <w:rPr>
@@ -126,30 +149,7 @@
           <w:szCs w:val="22"/>
           <w:lang w:eastAsia="fr-FR"/>
         </w:rPr>
-        <w:t>Avenant aux conventions</w:t>
-      </w:r>
-      <w:r>
-        <w:rPr>
-          <w:rFonts w:cs="TimesNewRomanPSMT"/>
-          <w:bCs/>
-        </w:rPr>
-        <w:t xml:space="preserve">{% </w:t>
-      </w:r>
-      <w:proofErr w:type="spellStart"/>
-      <w:r>
-        <w:rPr>
-          <w:rFonts w:cs="TimesNewRomanPSMT"/>
-          <w:bCs/>
-        </w:rPr>
-        <w:t>endif</w:t>
-      </w:r>
-      <w:proofErr w:type="spellEnd"/>
-      <w:r>
-        <w:rPr>
-          <w:rFonts w:cs="TimesNewRomanPSMT"/>
-          <w:bCs/>
-        </w:rPr>
-        <w:t xml:space="preserve"> %}</w:t>
+        <w:t>for parent in convention.</w:t>
       </w:r>
       <w:r>
         <w:rPr>
@@ -157,7 +157,7 @@
           <w:szCs w:val="22"/>
           <w:lang w:eastAsia="fr-FR"/>
         </w:rPr>
-        <w:t xml:space="preserve"> n°</w:t>
+        <w:t>parents_2nd_vie</w:t>
       </w:r>
       <w:r>
         <w:rPr>
@@ -165,7 +165,7 @@
           <w:szCs w:val="22"/>
           <w:lang w:eastAsia="fr-FR"/>
         </w:rPr>
-        <w:t xml:space="preserve">{% </w:t>
+        <w:t>.all()</w:t>
       </w:r>
       <w:r>
         <w:rPr>
@@ -173,7 +173,7 @@
           <w:szCs w:val="22"/>
           <w:lang w:eastAsia="fr-FR"/>
         </w:rPr>
-        <w:t>for parent in convention.</w:t>
+        <w:t xml:space="preserve"> %}{{</w:t>
       </w:r>
       <w:r>
         <w:rPr>
@@ -181,15 +181,16 @@
           <w:szCs w:val="22"/>
           <w:lang w:eastAsia="fr-FR"/>
         </w:rPr>
-        <w:t>parents_2nd_vie</w:t>
-      </w:r>
+        <w:t xml:space="preserve"> </w:t>
+      </w:r>
+      <w:proofErr w:type="spellStart"/>
       <w:r>
         <w:rPr>
           <w:color w:val="000000"/>
           <w:szCs w:val="22"/>
           <w:lang w:eastAsia="fr-FR"/>
         </w:rPr>
-        <w:t>.all()</w:t>
+        <w:t>parent</w:t>
       </w:r>
       <w:r>
         <w:rPr>
@@ -197,101 +198,124 @@
           <w:szCs w:val="22"/>
           <w:lang w:eastAsia="fr-FR"/>
         </w:rPr>
-        <w:t xml:space="preserve"> %}{{</w:t>
-      </w:r>
+        <w:t>.numero</w:t>
+      </w:r>
+      <w:proofErr w:type="spellEnd"/>
       <w:r>
         <w:rPr>
           <w:color w:val="000000"/>
           <w:szCs w:val="22"/>
           <w:lang w:eastAsia="fr-FR"/>
         </w:rPr>
+        <w:t>}}</w:t>
+      </w:r>
+      <w:r>
+        <w:rPr>
+          <w:rFonts w:cs="TimesNewRomanPSMT"/>
+        </w:rPr>
+        <w:t xml:space="preserve">{% if not </w:t>
+      </w:r>
+      <w:proofErr w:type="spellStart"/>
+      <w:r>
+        <w:rPr>
+          <w:rFonts w:cs="TimesNewRomanPSMT"/>
+        </w:rPr>
+        <w:t>loop.last</w:t>
+      </w:r>
+      <w:proofErr w:type="spellEnd"/>
+      <w:r>
+        <w:rPr>
+          <w:rFonts w:cs="TimesNewRomanPSMT"/>
+        </w:rPr>
+        <w:t xml:space="preserve"> %},</w:t>
+      </w:r>
+      <w:r>
+        <w:rPr>
+          <w:rFonts w:cs="TimesNewRomanPSMT"/>
+        </w:rPr>
         <w:t xml:space="preserve"> </w:t>
       </w:r>
+      <w:r>
+        <w:rPr>
+          <w:rFonts w:cs="TimesNewRomanPSMT"/>
+        </w:rPr>
+        <w:t xml:space="preserve">{% </w:t>
+      </w:r>
       <w:proofErr w:type="spellStart"/>
       <w:r>
         <w:rPr>
+          <w:rFonts w:cs="TimesNewRomanPSMT"/>
+        </w:rPr>
+        <w:t>endif</w:t>
+      </w:r>
+      <w:proofErr w:type="spellEnd"/>
+      <w:r>
+        <w:rPr>
+          <w:rFonts w:cs="TimesNewRomanPSMT"/>
+        </w:rPr>
+        <w:t xml:space="preserve"> %}{% </w:t>
+      </w:r>
+      <w:proofErr w:type="spellStart"/>
+      <w:r>
+        <w:rPr>
+          <w:rFonts w:cs="TimesNewRomanPSMT"/>
+        </w:rPr>
+        <w:t>endfor</w:t>
+      </w:r>
+      <w:proofErr w:type="spellEnd"/>
+      <w:r>
+        <w:rPr>
+          <w:rFonts w:cs="TimesNewRomanPSMT"/>
+        </w:rPr>
+        <w:t xml:space="preserve"> %}</w:t>
+      </w:r>
+    </w:p>
+    <w:p>
+      <w:pPr>
+        <w:spacing w:after="262" w:line="244" w:lineRule="auto"/>
+        <w:ind w:left="-5" w:right="3"/>
+        <w:jc w:val="both"/>
+        <w:rPr>
+          <w:b/>
+          <w:bCs/>
           <w:color w:val="000000"/>
           <w:szCs w:val="22"/>
           <w:lang w:eastAsia="fr-FR"/>
         </w:rPr>
-        <w:t>parent</w:t>
-      </w:r>
-      <w:r>
-        <w:rPr>
+      </w:pPr>
+      <w:r>
+        <w:rPr>
+          <w:b/>
+          <w:bCs/>
           <w:color w:val="000000"/>
           <w:szCs w:val="22"/>
           <w:lang w:eastAsia="fr-FR"/>
         </w:rPr>
-        <w:t>.numero</w:t>
-      </w:r>
-      <w:proofErr w:type="spellEnd"/>
-      <w:r>
-        <w:rPr>
+        <w:t>Article 1er.</w:t>
+      </w:r>
+    </w:p>
+    <w:p>
+      <w:pPr>
+        <w:spacing w:after="262" w:line="244" w:lineRule="auto"/>
+        <w:ind w:left="-5" w:right="3"/>
+        <w:jc w:val="both"/>
+        <w:rPr>
+          <w:b/>
+          <w:bCs/>
           <w:color w:val="000000"/>
           <w:szCs w:val="22"/>
           <w:lang w:eastAsia="fr-FR"/>
         </w:rPr>
-        <w:t>}}</w:t>
-      </w:r>
-      <w:r>
-        <w:rPr>
-          <w:rFonts w:cs="TimesNewRomanPSMT"/>
-        </w:rPr>
-        <w:t xml:space="preserve">{% if not </w:t>
-      </w:r>
-      <w:proofErr w:type="spellStart"/>
-      <w:r>
-        <w:rPr>
-          <w:rFonts w:cs="TimesNewRomanPSMT"/>
-        </w:rPr>
-        <w:t>loop.last</w:t>
-      </w:r>
-      <w:proofErr w:type="spellEnd"/>
-      <w:r>
-        <w:rPr>
-          <w:rFonts w:cs="TimesNewRomanPSMT"/>
-        </w:rPr>
-        <w:t xml:space="preserve"> %},</w:t>
-      </w:r>
-      <w:r>
-        <w:rPr>
-          <w:rFonts w:cs="TimesNewRomanPSMT"/>
-        </w:rPr>
-        <w:t xml:space="preserve"> </w:t>
-      </w:r>
-      <w:r>
-        <w:rPr>
-          <w:rFonts w:cs="TimesNewRomanPSMT"/>
-        </w:rPr>
-        <w:t xml:space="preserve">{% </w:t>
-      </w:r>
-      <w:proofErr w:type="spellStart"/>
-      <w:r>
-        <w:rPr>
-          <w:rFonts w:cs="TimesNewRomanPSMT"/>
-        </w:rPr>
-        <w:t>endif</w:t>
-      </w:r>
-      <w:proofErr w:type="spellEnd"/>
-      <w:r>
-        <w:rPr>
-          <w:rFonts w:cs="TimesNewRomanPSMT"/>
-        </w:rPr>
-        <w:t xml:space="preserve"> %}{% </w:t>
-      </w:r>
-      <w:proofErr w:type="spellStart"/>
-      <w:r>
-        <w:rPr>
-          <w:rFonts w:cs="TimesNewRomanPSMT"/>
-        </w:rPr>
-        <w:t>endfor</w:t>
-      </w:r>
-      <w:proofErr w:type="spellEnd"/>
-      <w:r>
-        <w:rPr>
-          <w:rFonts w:cs="TimesNewRomanPSMT"/>
-        </w:rPr>
-        <w:t xml:space="preserve"> %}</w:t>
+      </w:pPr>
+      <w:r>
+        <w:rPr>
+          <w:b/>
+          <w:bCs/>
+          <w:color w:val="000000"/>
+          <w:szCs w:val="22"/>
+          <w:lang w:eastAsia="fr-FR"/>
+        </w:rPr>
+        <w:t>Objet de l’avenant</w:t>
       </w:r>
     </w:p>
     <w:p>
@@ -300,8 +324,6 @@
         <w:ind w:left="-5" w:right="3"/>
         <w:jc w:val="both"/>
         <w:rPr>
-          <w:b/>
-          <w:bCs/>
           <w:color w:val="000000"/>
           <w:szCs w:val="22"/>
           <w:lang w:eastAsia="fr-FR"/>
@@ -309,73 +331,84 @@
       </w:pPr>
       <w:r>
         <w:rPr>
-          <w:b/>
-          <w:bCs/>
           <w:color w:val="000000"/>
           <w:szCs w:val="22"/>
           <w:lang w:eastAsia="fr-FR"/>
         </w:rPr>
-        <w:t>Article 1er.</w:t>
-      </w:r>
-    </w:p>
-    <w:p>
-      <w:pPr>
-        <w:spacing w:after="262" w:line="244" w:lineRule="auto"/>
-        <w:ind w:left="-5" w:right="3"/>
-        <w:jc w:val="both"/>
-        <w:rPr>
-          <w:b/>
-          <w:bCs/>
+        <w:t>{% if</w:t>
+      </w:r>
+      <w:r>
+        <w:rPr>
           <w:color w:val="000000"/>
           <w:szCs w:val="22"/>
           <w:lang w:eastAsia="fr-FR"/>
         </w:rPr>
-      </w:pPr>
-      <w:r>
-        <w:rPr>
-          <w:b/>
-          <w:bCs/>
+        <w:t xml:space="preserve"> convention.</w:t>
+      </w:r>
+      <w:r>
+        <w:rPr>
           <w:color w:val="000000"/>
           <w:szCs w:val="22"/>
           <w:lang w:eastAsia="fr-FR"/>
         </w:rPr>
-        <w:t>Objet de l’avenant</w:t>
-      </w:r>
-    </w:p>
-    <w:p>
-      <w:pPr>
-        <w:spacing w:after="262" w:line="244" w:lineRule="auto"/>
-        <w:ind w:left="-5" w:right="3"/>
-        <w:jc w:val="both"/>
+        <w:t>parents_2nd_vie</w:t>
+      </w:r>
+      <w:r>
         <w:rPr>
           <w:color w:val="000000"/>
           <w:szCs w:val="22"/>
           <w:lang w:eastAsia="fr-FR"/>
         </w:rPr>
-      </w:pPr>
+        <w:t>.all()</w:t>
+      </w:r>
       <w:r>
         <w:rPr>
           <w:color w:val="000000"/>
           <w:szCs w:val="22"/>
           <w:lang w:eastAsia="fr-FR"/>
         </w:rPr>
-        <w:t>{% if</w:t>
-      </w:r>
+        <w:t>|</w:t>
+      </w:r>
+      <w:proofErr w:type="spellStart"/>
       <w:r>
         <w:rPr>
           <w:color w:val="000000"/>
           <w:szCs w:val="22"/>
           <w:lang w:eastAsia="fr-FR"/>
         </w:rPr>
-        <w:t xml:space="preserve"> convention.</w:t>
-      </w:r>
+        <w:t>length</w:t>
+      </w:r>
+      <w:proofErr w:type="spellEnd"/>
       <w:r>
         <w:rPr>
           <w:color w:val="000000"/>
           <w:szCs w:val="22"/>
           <w:lang w:eastAsia="fr-FR"/>
         </w:rPr>
-        <w:t>parents_2nd_vie</w:t>
+        <w:t xml:space="preserve"> == 1 %}La convention</w:t>
+      </w:r>
+      <w:r>
+        <w:rPr>
+          <w:rFonts w:cs="TimesNewRomanPSMT"/>
+          <w:bCs/>
+        </w:rPr>
+        <w:t xml:space="preserve">{% </w:t>
+      </w:r>
+      <w:proofErr w:type="spellStart"/>
+      <w:r>
+        <w:rPr>
+          <w:rFonts w:cs="TimesNewRomanPSMT"/>
+          <w:bCs/>
+        </w:rPr>
+        <w:t>else</w:t>
+      </w:r>
+      <w:proofErr w:type="spellEnd"/>
+      <w:r>
+        <w:rPr>
+          <w:rFonts w:cs="TimesNewRomanPSMT"/>
+          <w:bCs/>
+        </w:rPr>
+        <w:t xml:space="preserve"> %}</w:t>
       </w:r>
       <w:r>
         <w:rPr>
@@ -383,7 +416,7 @@
           <w:szCs w:val="22"/>
           <w:lang w:eastAsia="fr-FR"/>
         </w:rPr>
-        <w:t>.all()</w:t>
+        <w:t xml:space="preserve"> </w:t>
       </w:r>
       <w:r>
         <w:rPr>
@@ -391,94 +424,14 @@
           <w:szCs w:val="22"/>
           <w:lang w:eastAsia="fr-FR"/>
         </w:rPr>
-        <w:t>|</w:t>
-      </w:r>
-      <w:proofErr w:type="spellStart"/>
-      <w:r>
-        <w:rPr>
-          <w:color w:val="000000"/>
-          <w:szCs w:val="22"/>
-          <w:lang w:eastAsia="fr-FR"/>
-        </w:rPr>
-        <w:t>length</w:t>
-      </w:r>
-      <w:proofErr w:type="spellEnd"/>
-      <w:r>
-        <w:rPr>
-          <w:color w:val="000000"/>
-          <w:szCs w:val="22"/>
-          <w:lang w:eastAsia="fr-FR"/>
-        </w:rPr>
-        <w:t xml:space="preserve"> == 1 %}</w:t>
-      </w:r>
-      <w:r>
-        <w:rPr>
-          <w:color w:val="000000"/>
-          <w:szCs w:val="22"/>
-          <w:lang w:eastAsia="fr-FR"/>
-        </w:rPr>
-        <w:t>L</w:t>
-      </w:r>
-      <w:r>
-        <w:rPr>
-          <w:color w:val="000000"/>
-          <w:szCs w:val="22"/>
-          <w:lang w:eastAsia="fr-FR"/>
-        </w:rPr>
-        <w:t>a convention</w:t>
+        <w:t>Les conventions</w:t>
       </w:r>
       <w:r>
         <w:rPr>
           <w:rFonts w:cs="TimesNewRomanPSMT"/>
           <w:bCs/>
         </w:rPr>
-        <w:t xml:space="preserve">{% </w:t>
-      </w:r>
-      <w:proofErr w:type="spellStart"/>
-      <w:r>
-        <w:rPr>
-          <w:rFonts w:cs="TimesNewRomanPSMT"/>
-          <w:bCs/>
-        </w:rPr>
-        <w:t>else</w:t>
-      </w:r>
-      <w:proofErr w:type="spellEnd"/>
-      <w:r>
-        <w:rPr>
-          <w:rFonts w:cs="TimesNewRomanPSMT"/>
-          <w:bCs/>
-        </w:rPr>
-        <w:t xml:space="preserve"> %}</w:t>
-      </w:r>
-      <w:r>
-        <w:rPr>
-          <w:color w:val="000000"/>
-          <w:szCs w:val="22"/>
-          <w:lang w:eastAsia="fr-FR"/>
-        </w:rPr>
-        <w:t xml:space="preserve"> </w:t>
-      </w:r>
-      <w:r>
-        <w:rPr>
-          <w:color w:val="000000"/>
-          <w:szCs w:val="22"/>
-          <w:lang w:eastAsia="fr-FR"/>
-        </w:rPr>
-        <w:t>Les conventions</w:t>
-      </w:r>
-      <w:r>
-        <w:rPr>
-          <w:rFonts w:cs="TimesNewRomanPSMT"/>
-          <w:bCs/>
-        </w:rPr>
-        <w:t xml:space="preserve"> </w:t>
-      </w:r>
-      <w:r>
-        <w:rPr>
-          <w:rFonts w:cs="TimesNewRomanPSMT"/>
-          <w:bCs/>
-        </w:rPr>
-        <w:t xml:space="preserve">{% </w:t>
+        <w:t xml:space="preserve"> {% </w:t>
       </w:r>
       <w:proofErr w:type="spellStart"/>
       <w:r>
@@ -1081,15 +1034,7 @@
           <w:szCs w:val="22"/>
           <w:lang w:eastAsia="fr-FR"/>
         </w:rPr>
-        <w:t xml:space="preserve"> == 1 %}La convention</w:t>
-      </w:r>
-      <w:r>
-        <w:rPr>
-          <w:color w:val="000000"/>
-          <w:szCs w:val="22"/>
-          <w:lang w:eastAsia="fr-FR"/>
-        </w:rPr>
-        <w:t xml:space="preserve"> expire</w:t>
+        <w:t xml:space="preserve"> == 1 %}La convention expire</w:t>
       </w:r>
       <w:r>
         <w:rPr>
@@ -15641,7 +15586,13 @@
         <w:rPr>
           <w:rFonts w:cs="TimesNewRomanPSMT"/>
         </w:rPr>
-        <w:t xml:space="preserve">Prêteur : {{ </w:t>
+        <w:t>Organisme financeur </w:t>
+      </w:r>
+      <w:r>
+        <w:rPr>
+          <w:rFonts w:cs="TimesNewRomanPSMT"/>
+        </w:rPr>
+        <w:t xml:space="preserve">: {{ </w:t>
       </w:r>
       <w:proofErr w:type="spellStart"/>
       <w:r>
@@ -16015,7 +15966,13 @@
         <w:rPr>
           <w:rFonts w:cs="TimesNewRomanPSMT"/>
         </w:rPr>
-        <w:t xml:space="preserve">Prêteur : {{ </w:t>
+        <w:t>Organisme financeur </w:t>
+      </w:r>
+      <w:r>
+        <w:rPr>
+          <w:rFonts w:cs="TimesNewRomanPSMT"/>
+        </w:rPr>
+        <w:t xml:space="preserve">: {{ </w:t>
       </w:r>
       <w:proofErr w:type="spellStart"/>
       <w:r>
@@ -19832,7 +19789,6 @@
   <w:style w:type="character" w:default="1" w:styleId="Policepardfaut">
     <w:name w:val="Default Paragraph Font"/>
     <w:uiPriority w:val="1"/>
-    <w:semiHidden/>
     <w:unhideWhenUsed/>
   </w:style>
   <w:style w:type="table" w:default="1" w:styleId="TableauNormal">

</xml_diff>

<commit_message>
226 : Remplacer la notion de Prêteur dans les template par Organisme financeur (#2171)
</commit_message>
<xml_diff>
--- a/documents/Avenant2ndeVie-HLM-template.docx
+++ b/documents/Avenant2ndeVie-HLM-template.docx
@@ -21,7 +21,7 @@
           <w:szCs w:val="22"/>
           <w:lang w:eastAsia="fr-FR"/>
         </w:rPr>
-        <w:t xml:space="preserve">{% </w:t>
+        <w:t>{% if</w:t>
       </w:r>
       <w:r>
         <w:rPr>
@@ -29,7 +29,7 @@
           <w:szCs w:val="22"/>
           <w:lang w:eastAsia="fr-FR"/>
         </w:rPr>
-        <w:t>if</w:t>
+        <w:t xml:space="preserve"> convention.</w:t>
       </w:r>
       <w:r>
         <w:rPr>
@@ -37,7 +37,7 @@
           <w:szCs w:val="22"/>
           <w:lang w:eastAsia="fr-FR"/>
         </w:rPr>
-        <w:t xml:space="preserve"> convention.</w:t>
+        <w:t>parents_2nd_vie</w:t>
       </w:r>
       <w:r>
         <w:rPr>
@@ -45,7 +45,7 @@
           <w:szCs w:val="22"/>
           <w:lang w:eastAsia="fr-FR"/>
         </w:rPr>
-        <w:t>parents_2nd_vie</w:t>
+        <w:t>.all()</w:t>
       </w:r>
       <w:r>
         <w:rPr>
@@ -53,33 +53,79 @@
           <w:szCs w:val="22"/>
           <w:lang w:eastAsia="fr-FR"/>
         </w:rPr>
-        <w:t>.all()</w:t>
-      </w:r>
+        <w:t>|</w:t>
+      </w:r>
+      <w:proofErr w:type="spellStart"/>
       <w:r>
         <w:rPr>
           <w:color w:val="000000"/>
           <w:szCs w:val="22"/>
           <w:lang w:eastAsia="fr-FR"/>
         </w:rPr>
-        <w:t>|</w:t>
-      </w:r>
-      <w:proofErr w:type="spellStart"/>
+        <w:t>length</w:t>
+      </w:r>
+      <w:proofErr w:type="spellEnd"/>
       <w:r>
         <w:rPr>
           <w:color w:val="000000"/>
           <w:szCs w:val="22"/>
           <w:lang w:eastAsia="fr-FR"/>
         </w:rPr>
-        <w:t>length</w:t>
+        <w:t xml:space="preserve"> == 1 %}Avenant à la convention</w:t>
+      </w:r>
+      <w:r>
+        <w:rPr>
+          <w:rFonts w:cs="TimesNewRomanPSMT"/>
+          <w:bCs/>
+        </w:rPr>
+        <w:t xml:space="preserve">{% </w:t>
+      </w:r>
+      <w:proofErr w:type="spellStart"/>
+      <w:r>
+        <w:rPr>
+          <w:rFonts w:cs="TimesNewRomanPSMT"/>
+          <w:bCs/>
+        </w:rPr>
+        <w:t>else</w:t>
       </w:r>
       <w:proofErr w:type="spellEnd"/>
+      <w:r>
+        <w:rPr>
+          <w:rFonts w:cs="TimesNewRomanPSMT"/>
+          <w:bCs/>
+        </w:rPr>
+        <w:t xml:space="preserve"> %}</w:t>
+      </w:r>
       <w:r>
         <w:rPr>
           <w:color w:val="000000"/>
           <w:szCs w:val="22"/>
           <w:lang w:eastAsia="fr-FR"/>
         </w:rPr>
-        <w:t xml:space="preserve"> == 1</w:t>
+        <w:t>Avenant aux conventions</w:t>
+      </w:r>
+      <w:r>
+        <w:rPr>
+          <w:rFonts w:cs="TimesNewRomanPSMT"/>
+          <w:bCs/>
+        </w:rPr>
+        <w:t xml:space="preserve">{% </w:t>
+      </w:r>
+      <w:proofErr w:type="spellStart"/>
+      <w:r>
+        <w:rPr>
+          <w:rFonts w:cs="TimesNewRomanPSMT"/>
+          <w:bCs/>
+        </w:rPr>
+        <w:t>endif</w:t>
+      </w:r>
+      <w:proofErr w:type="spellEnd"/>
+      <w:r>
+        <w:rPr>
+          <w:rFonts w:cs="TimesNewRomanPSMT"/>
+          <w:bCs/>
+        </w:rPr>
+        <w:t xml:space="preserve"> %}</w:t>
       </w:r>
       <w:r>
         <w:rPr>
@@ -87,7 +133,7 @@
           <w:szCs w:val="22"/>
           <w:lang w:eastAsia="fr-FR"/>
         </w:rPr>
-        <w:t xml:space="preserve"> %}</w:t>
+        <w:t xml:space="preserve"> n°</w:t>
       </w:r>
       <w:r>
         <w:rPr>
@@ -95,30 +141,7 @@
           <w:szCs w:val="22"/>
           <w:lang w:eastAsia="fr-FR"/>
         </w:rPr>
-        <w:t>Avenant à la convention</w:t>
-      </w:r>
-      <w:r>
-        <w:rPr>
-          <w:rFonts w:cs="TimesNewRomanPSMT"/>
-          <w:bCs/>
-        </w:rPr>
         <w:t xml:space="preserve">{% </w:t>
-      </w:r>
-      <w:proofErr w:type="spellStart"/>
-      <w:r>
-        <w:rPr>
-          <w:rFonts w:cs="TimesNewRomanPSMT"/>
-          <w:bCs/>
-        </w:rPr>
-        <w:t>else</w:t>
-      </w:r>
-      <w:proofErr w:type="spellEnd"/>
-      <w:r>
-        <w:rPr>
-          <w:rFonts w:cs="TimesNewRomanPSMT"/>
-          <w:bCs/>
-        </w:rPr>
-        <w:t xml:space="preserve"> %}</w:t>
       </w:r>
       <w:r>
         <w:rPr>
@@ -126,30 +149,7 @@
           <w:szCs w:val="22"/>
           <w:lang w:eastAsia="fr-FR"/>
         </w:rPr>
-        <w:t>Avenant aux conventions</w:t>
-      </w:r>
-      <w:r>
-        <w:rPr>
-          <w:rFonts w:cs="TimesNewRomanPSMT"/>
-          <w:bCs/>
-        </w:rPr>
-        <w:t xml:space="preserve">{% </w:t>
-      </w:r>
-      <w:proofErr w:type="spellStart"/>
-      <w:r>
-        <w:rPr>
-          <w:rFonts w:cs="TimesNewRomanPSMT"/>
-          <w:bCs/>
-        </w:rPr>
-        <w:t>endif</w:t>
-      </w:r>
-      <w:proofErr w:type="spellEnd"/>
-      <w:r>
-        <w:rPr>
-          <w:rFonts w:cs="TimesNewRomanPSMT"/>
-          <w:bCs/>
-        </w:rPr>
-        <w:t xml:space="preserve"> %}</w:t>
+        <w:t>for parent in convention.</w:t>
       </w:r>
       <w:r>
         <w:rPr>
@@ -157,7 +157,7 @@
           <w:szCs w:val="22"/>
           <w:lang w:eastAsia="fr-FR"/>
         </w:rPr>
-        <w:t xml:space="preserve"> n°</w:t>
+        <w:t>parents_2nd_vie</w:t>
       </w:r>
       <w:r>
         <w:rPr>
@@ -165,7 +165,7 @@
           <w:szCs w:val="22"/>
           <w:lang w:eastAsia="fr-FR"/>
         </w:rPr>
-        <w:t xml:space="preserve">{% </w:t>
+        <w:t>.all()</w:t>
       </w:r>
       <w:r>
         <w:rPr>
@@ -173,7 +173,7 @@
           <w:szCs w:val="22"/>
           <w:lang w:eastAsia="fr-FR"/>
         </w:rPr>
-        <w:t>for parent in convention.</w:t>
+        <w:t xml:space="preserve"> %}{{</w:t>
       </w:r>
       <w:r>
         <w:rPr>
@@ -181,15 +181,16 @@
           <w:szCs w:val="22"/>
           <w:lang w:eastAsia="fr-FR"/>
         </w:rPr>
-        <w:t>parents_2nd_vie</w:t>
-      </w:r>
+        <w:t xml:space="preserve"> </w:t>
+      </w:r>
+      <w:proofErr w:type="spellStart"/>
       <w:r>
         <w:rPr>
           <w:color w:val="000000"/>
           <w:szCs w:val="22"/>
           <w:lang w:eastAsia="fr-FR"/>
         </w:rPr>
-        <w:t>.all()</w:t>
+        <w:t>parent</w:t>
       </w:r>
       <w:r>
         <w:rPr>
@@ -197,101 +198,124 @@
           <w:szCs w:val="22"/>
           <w:lang w:eastAsia="fr-FR"/>
         </w:rPr>
-        <w:t xml:space="preserve"> %}{{</w:t>
-      </w:r>
+        <w:t>.numero</w:t>
+      </w:r>
+      <w:proofErr w:type="spellEnd"/>
       <w:r>
         <w:rPr>
           <w:color w:val="000000"/>
           <w:szCs w:val="22"/>
           <w:lang w:eastAsia="fr-FR"/>
         </w:rPr>
+        <w:t>}}</w:t>
+      </w:r>
+      <w:r>
+        <w:rPr>
+          <w:rFonts w:cs="TimesNewRomanPSMT"/>
+        </w:rPr>
+        <w:t xml:space="preserve">{% if not </w:t>
+      </w:r>
+      <w:proofErr w:type="spellStart"/>
+      <w:r>
+        <w:rPr>
+          <w:rFonts w:cs="TimesNewRomanPSMT"/>
+        </w:rPr>
+        <w:t>loop.last</w:t>
+      </w:r>
+      <w:proofErr w:type="spellEnd"/>
+      <w:r>
+        <w:rPr>
+          <w:rFonts w:cs="TimesNewRomanPSMT"/>
+        </w:rPr>
+        <w:t xml:space="preserve"> %},</w:t>
+      </w:r>
+      <w:r>
+        <w:rPr>
+          <w:rFonts w:cs="TimesNewRomanPSMT"/>
+        </w:rPr>
         <w:t xml:space="preserve"> </w:t>
       </w:r>
+      <w:r>
+        <w:rPr>
+          <w:rFonts w:cs="TimesNewRomanPSMT"/>
+        </w:rPr>
+        <w:t xml:space="preserve">{% </w:t>
+      </w:r>
       <w:proofErr w:type="spellStart"/>
       <w:r>
         <w:rPr>
+          <w:rFonts w:cs="TimesNewRomanPSMT"/>
+        </w:rPr>
+        <w:t>endif</w:t>
+      </w:r>
+      <w:proofErr w:type="spellEnd"/>
+      <w:r>
+        <w:rPr>
+          <w:rFonts w:cs="TimesNewRomanPSMT"/>
+        </w:rPr>
+        <w:t xml:space="preserve"> %}{% </w:t>
+      </w:r>
+      <w:proofErr w:type="spellStart"/>
+      <w:r>
+        <w:rPr>
+          <w:rFonts w:cs="TimesNewRomanPSMT"/>
+        </w:rPr>
+        <w:t>endfor</w:t>
+      </w:r>
+      <w:proofErr w:type="spellEnd"/>
+      <w:r>
+        <w:rPr>
+          <w:rFonts w:cs="TimesNewRomanPSMT"/>
+        </w:rPr>
+        <w:t xml:space="preserve"> %}</w:t>
+      </w:r>
+    </w:p>
+    <w:p>
+      <w:pPr>
+        <w:spacing w:after="262" w:line="244" w:lineRule="auto"/>
+        <w:ind w:left="-5" w:right="3"/>
+        <w:jc w:val="both"/>
+        <w:rPr>
+          <w:b/>
+          <w:bCs/>
           <w:color w:val="000000"/>
           <w:szCs w:val="22"/>
           <w:lang w:eastAsia="fr-FR"/>
         </w:rPr>
-        <w:t>parent</w:t>
-      </w:r>
-      <w:r>
-        <w:rPr>
+      </w:pPr>
+      <w:r>
+        <w:rPr>
+          <w:b/>
+          <w:bCs/>
           <w:color w:val="000000"/>
           <w:szCs w:val="22"/>
           <w:lang w:eastAsia="fr-FR"/>
         </w:rPr>
-        <w:t>.numero</w:t>
-      </w:r>
-      <w:proofErr w:type="spellEnd"/>
-      <w:r>
-        <w:rPr>
+        <w:t>Article 1er.</w:t>
+      </w:r>
+    </w:p>
+    <w:p>
+      <w:pPr>
+        <w:spacing w:after="262" w:line="244" w:lineRule="auto"/>
+        <w:ind w:left="-5" w:right="3"/>
+        <w:jc w:val="both"/>
+        <w:rPr>
+          <w:b/>
+          <w:bCs/>
           <w:color w:val="000000"/>
           <w:szCs w:val="22"/>
           <w:lang w:eastAsia="fr-FR"/>
         </w:rPr>
-        <w:t>}}</w:t>
-      </w:r>
-      <w:r>
-        <w:rPr>
-          <w:rFonts w:cs="TimesNewRomanPSMT"/>
-        </w:rPr>
-        <w:t xml:space="preserve">{% if not </w:t>
-      </w:r>
-      <w:proofErr w:type="spellStart"/>
-      <w:r>
-        <w:rPr>
-          <w:rFonts w:cs="TimesNewRomanPSMT"/>
-        </w:rPr>
-        <w:t>loop.last</w:t>
-      </w:r>
-      <w:proofErr w:type="spellEnd"/>
-      <w:r>
-        <w:rPr>
-          <w:rFonts w:cs="TimesNewRomanPSMT"/>
-        </w:rPr>
-        <w:t xml:space="preserve"> %},</w:t>
-      </w:r>
-      <w:r>
-        <w:rPr>
-          <w:rFonts w:cs="TimesNewRomanPSMT"/>
-        </w:rPr>
-        <w:t xml:space="preserve"> </w:t>
-      </w:r>
-      <w:r>
-        <w:rPr>
-          <w:rFonts w:cs="TimesNewRomanPSMT"/>
-        </w:rPr>
-        <w:t xml:space="preserve">{% </w:t>
-      </w:r>
-      <w:proofErr w:type="spellStart"/>
-      <w:r>
-        <w:rPr>
-          <w:rFonts w:cs="TimesNewRomanPSMT"/>
-        </w:rPr>
-        <w:t>endif</w:t>
-      </w:r>
-      <w:proofErr w:type="spellEnd"/>
-      <w:r>
-        <w:rPr>
-          <w:rFonts w:cs="TimesNewRomanPSMT"/>
-        </w:rPr>
-        <w:t xml:space="preserve"> %}{% </w:t>
-      </w:r>
-      <w:proofErr w:type="spellStart"/>
-      <w:r>
-        <w:rPr>
-          <w:rFonts w:cs="TimesNewRomanPSMT"/>
-        </w:rPr>
-        <w:t>endfor</w:t>
-      </w:r>
-      <w:proofErr w:type="spellEnd"/>
-      <w:r>
-        <w:rPr>
-          <w:rFonts w:cs="TimesNewRomanPSMT"/>
-        </w:rPr>
-        <w:t xml:space="preserve"> %}</w:t>
+      </w:pPr>
+      <w:r>
+        <w:rPr>
+          <w:b/>
+          <w:bCs/>
+          <w:color w:val="000000"/>
+          <w:szCs w:val="22"/>
+          <w:lang w:eastAsia="fr-FR"/>
+        </w:rPr>
+        <w:t>Objet de l’avenant</w:t>
       </w:r>
     </w:p>
     <w:p>
@@ -300,8 +324,6 @@
         <w:ind w:left="-5" w:right="3"/>
         <w:jc w:val="both"/>
         <w:rPr>
-          <w:b/>
-          <w:bCs/>
           <w:color w:val="000000"/>
           <w:szCs w:val="22"/>
           <w:lang w:eastAsia="fr-FR"/>
@@ -309,73 +331,84 @@
       </w:pPr>
       <w:r>
         <w:rPr>
-          <w:b/>
-          <w:bCs/>
           <w:color w:val="000000"/>
           <w:szCs w:val="22"/>
           <w:lang w:eastAsia="fr-FR"/>
         </w:rPr>
-        <w:t>Article 1er.</w:t>
-      </w:r>
-    </w:p>
-    <w:p>
-      <w:pPr>
-        <w:spacing w:after="262" w:line="244" w:lineRule="auto"/>
-        <w:ind w:left="-5" w:right="3"/>
-        <w:jc w:val="both"/>
-        <w:rPr>
-          <w:b/>
-          <w:bCs/>
+        <w:t>{% if</w:t>
+      </w:r>
+      <w:r>
+        <w:rPr>
           <w:color w:val="000000"/>
           <w:szCs w:val="22"/>
           <w:lang w:eastAsia="fr-FR"/>
         </w:rPr>
-      </w:pPr>
-      <w:r>
-        <w:rPr>
-          <w:b/>
-          <w:bCs/>
+        <w:t xml:space="preserve"> convention.</w:t>
+      </w:r>
+      <w:r>
+        <w:rPr>
           <w:color w:val="000000"/>
           <w:szCs w:val="22"/>
           <w:lang w:eastAsia="fr-FR"/>
         </w:rPr>
-        <w:t>Objet de l’avenant</w:t>
-      </w:r>
-    </w:p>
-    <w:p>
-      <w:pPr>
-        <w:spacing w:after="262" w:line="244" w:lineRule="auto"/>
-        <w:ind w:left="-5" w:right="3"/>
-        <w:jc w:val="both"/>
+        <w:t>parents_2nd_vie</w:t>
+      </w:r>
+      <w:r>
         <w:rPr>
           <w:color w:val="000000"/>
           <w:szCs w:val="22"/>
           <w:lang w:eastAsia="fr-FR"/>
         </w:rPr>
-      </w:pPr>
+        <w:t>.all()</w:t>
+      </w:r>
       <w:r>
         <w:rPr>
           <w:color w:val="000000"/>
           <w:szCs w:val="22"/>
           <w:lang w:eastAsia="fr-FR"/>
         </w:rPr>
-        <w:t>{% if</w:t>
-      </w:r>
+        <w:t>|</w:t>
+      </w:r>
+      <w:proofErr w:type="spellStart"/>
       <w:r>
         <w:rPr>
           <w:color w:val="000000"/>
           <w:szCs w:val="22"/>
           <w:lang w:eastAsia="fr-FR"/>
         </w:rPr>
-        <w:t xml:space="preserve"> convention.</w:t>
-      </w:r>
+        <w:t>length</w:t>
+      </w:r>
+      <w:proofErr w:type="spellEnd"/>
       <w:r>
         <w:rPr>
           <w:color w:val="000000"/>
           <w:szCs w:val="22"/>
           <w:lang w:eastAsia="fr-FR"/>
         </w:rPr>
-        <w:t>parents_2nd_vie</w:t>
+        <w:t xml:space="preserve"> == 1 %}La convention</w:t>
+      </w:r>
+      <w:r>
+        <w:rPr>
+          <w:rFonts w:cs="TimesNewRomanPSMT"/>
+          <w:bCs/>
+        </w:rPr>
+        <w:t xml:space="preserve">{% </w:t>
+      </w:r>
+      <w:proofErr w:type="spellStart"/>
+      <w:r>
+        <w:rPr>
+          <w:rFonts w:cs="TimesNewRomanPSMT"/>
+          <w:bCs/>
+        </w:rPr>
+        <w:t>else</w:t>
+      </w:r>
+      <w:proofErr w:type="spellEnd"/>
+      <w:r>
+        <w:rPr>
+          <w:rFonts w:cs="TimesNewRomanPSMT"/>
+          <w:bCs/>
+        </w:rPr>
+        <w:t xml:space="preserve"> %}</w:t>
       </w:r>
       <w:r>
         <w:rPr>
@@ -383,7 +416,7 @@
           <w:szCs w:val="22"/>
           <w:lang w:eastAsia="fr-FR"/>
         </w:rPr>
-        <w:t>.all()</w:t>
+        <w:t xml:space="preserve"> </w:t>
       </w:r>
       <w:r>
         <w:rPr>
@@ -391,94 +424,14 @@
           <w:szCs w:val="22"/>
           <w:lang w:eastAsia="fr-FR"/>
         </w:rPr>
-        <w:t>|</w:t>
-      </w:r>
-      <w:proofErr w:type="spellStart"/>
-      <w:r>
-        <w:rPr>
-          <w:color w:val="000000"/>
-          <w:szCs w:val="22"/>
-          <w:lang w:eastAsia="fr-FR"/>
-        </w:rPr>
-        <w:t>length</w:t>
-      </w:r>
-      <w:proofErr w:type="spellEnd"/>
-      <w:r>
-        <w:rPr>
-          <w:color w:val="000000"/>
-          <w:szCs w:val="22"/>
-          <w:lang w:eastAsia="fr-FR"/>
-        </w:rPr>
-        <w:t xml:space="preserve"> == 1 %}</w:t>
-      </w:r>
-      <w:r>
-        <w:rPr>
-          <w:color w:val="000000"/>
-          <w:szCs w:val="22"/>
-          <w:lang w:eastAsia="fr-FR"/>
-        </w:rPr>
-        <w:t>L</w:t>
-      </w:r>
-      <w:r>
-        <w:rPr>
-          <w:color w:val="000000"/>
-          <w:szCs w:val="22"/>
-          <w:lang w:eastAsia="fr-FR"/>
-        </w:rPr>
-        <w:t>a convention</w:t>
+        <w:t>Les conventions</w:t>
       </w:r>
       <w:r>
         <w:rPr>
           <w:rFonts w:cs="TimesNewRomanPSMT"/>
           <w:bCs/>
         </w:rPr>
-        <w:t xml:space="preserve">{% </w:t>
-      </w:r>
-      <w:proofErr w:type="spellStart"/>
-      <w:r>
-        <w:rPr>
-          <w:rFonts w:cs="TimesNewRomanPSMT"/>
-          <w:bCs/>
-        </w:rPr>
-        <w:t>else</w:t>
-      </w:r>
-      <w:proofErr w:type="spellEnd"/>
-      <w:r>
-        <w:rPr>
-          <w:rFonts w:cs="TimesNewRomanPSMT"/>
-          <w:bCs/>
-        </w:rPr>
-        <w:t xml:space="preserve"> %}</w:t>
-      </w:r>
-      <w:r>
-        <w:rPr>
-          <w:color w:val="000000"/>
-          <w:szCs w:val="22"/>
-          <w:lang w:eastAsia="fr-FR"/>
-        </w:rPr>
-        <w:t xml:space="preserve"> </w:t>
-      </w:r>
-      <w:r>
-        <w:rPr>
-          <w:color w:val="000000"/>
-          <w:szCs w:val="22"/>
-          <w:lang w:eastAsia="fr-FR"/>
-        </w:rPr>
-        <w:t>Les conventions</w:t>
-      </w:r>
-      <w:r>
-        <w:rPr>
-          <w:rFonts w:cs="TimesNewRomanPSMT"/>
-          <w:bCs/>
-        </w:rPr>
-        <w:t xml:space="preserve"> </w:t>
-      </w:r>
-      <w:r>
-        <w:rPr>
-          <w:rFonts w:cs="TimesNewRomanPSMT"/>
-          <w:bCs/>
-        </w:rPr>
-        <w:t xml:space="preserve">{% </w:t>
+        <w:t xml:space="preserve"> {% </w:t>
       </w:r>
       <w:proofErr w:type="spellStart"/>
       <w:r>
@@ -1081,15 +1034,7 @@
           <w:szCs w:val="22"/>
           <w:lang w:eastAsia="fr-FR"/>
         </w:rPr>
-        <w:t xml:space="preserve"> == 1 %}La convention</w:t>
-      </w:r>
-      <w:r>
-        <w:rPr>
-          <w:color w:val="000000"/>
-          <w:szCs w:val="22"/>
-          <w:lang w:eastAsia="fr-FR"/>
-        </w:rPr>
-        <w:t xml:space="preserve"> expire</w:t>
+        <w:t xml:space="preserve"> == 1 %}La convention expire</w:t>
       </w:r>
       <w:r>
         <w:rPr>
@@ -15641,7 +15586,13 @@
         <w:rPr>
           <w:rFonts w:cs="TimesNewRomanPSMT"/>
         </w:rPr>
-        <w:t xml:space="preserve">Prêteur : {{ </w:t>
+        <w:t>Organisme financeur </w:t>
+      </w:r>
+      <w:r>
+        <w:rPr>
+          <w:rFonts w:cs="TimesNewRomanPSMT"/>
+        </w:rPr>
+        <w:t xml:space="preserve">: {{ </w:t>
       </w:r>
       <w:proofErr w:type="spellStart"/>
       <w:r>
@@ -16015,7 +15966,13 @@
         <w:rPr>
           <w:rFonts w:cs="TimesNewRomanPSMT"/>
         </w:rPr>
-        <w:t xml:space="preserve">Prêteur : {{ </w:t>
+        <w:t>Organisme financeur </w:t>
+      </w:r>
+      <w:r>
+        <w:rPr>
+          <w:rFonts w:cs="TimesNewRomanPSMT"/>
+        </w:rPr>
+        <w:t xml:space="preserve">: {{ </w:t>
       </w:r>
       <w:proofErr w:type="spellStart"/>
       <w:r>
@@ -19832,7 +19789,6 @@
   <w:style w:type="character" w:default="1" w:styleId="Policepardfaut">
     <w:name w:val="Default Paragraph Font"/>
     <w:uiPriority w:val="1"/>
-    <w:semiHidden/>
     <w:unhideWhenUsed/>
   </w:style>
   <w:style w:type="table" w:default="1" w:styleId="TableauNormal">

</xml_diff>